<commit_message>
P8 : Periksa dan simpan
</commit_message>
<xml_diff>
--- a/P8/8. Worksheet_PABW_Pertemuan8 - ID.docx
+++ b/P8/8. Worksheet_PABW_Pertemuan8 - ID.docx
@@ -14963,6 +14963,9 @@
             <w:pPr>
               <w:spacing w:before="20" w:after="20" w:line="252" w:lineRule="auto"/>
             </w:pPr>
+            <w:r>
+              <w:t>15</w:t>
+            </w:r>
           </w:p>
         </w:tc>
         <w:tc>
@@ -14979,6 +14982,17 @@
             <w:pPr>
               <w:spacing w:before="20" w:after="20" w:line="252" w:lineRule="auto"/>
             </w:pPr>
+            <w:r>
+              <w:t xml:space="preserve">Baris 1-7 pada </w:t>
+            </w:r>
+            <w:proofErr w:type="spellStart"/>
+            <w:r>
+              <w:t>js</w:t>
+            </w:r>
+            <w:proofErr w:type="spellEnd"/>
+            <w:r>
+              <w:t>/app.js</w:t>
+            </w:r>
           </w:p>
         </w:tc>
       </w:tr>
@@ -15048,6 +15062,9 @@
             <w:pPr>
               <w:spacing w:before="20" w:after="20" w:line="252" w:lineRule="auto"/>
             </w:pPr>
+            <w:r>
+              <w:t>25</w:t>
+            </w:r>
           </w:p>
         </w:tc>
         <w:tc>
@@ -15064,6 +15081,17 @@
             <w:pPr>
               <w:spacing w:before="20" w:after="20" w:line="252" w:lineRule="auto"/>
             </w:pPr>
+            <w:r>
+              <w:t xml:space="preserve">Baris 10-14 pada </w:t>
+            </w:r>
+            <w:proofErr w:type="spellStart"/>
+            <w:r>
+              <w:t>js</w:t>
+            </w:r>
+            <w:proofErr w:type="spellEnd"/>
+            <w:r>
+              <w:t>/app.js</w:t>
+            </w:r>
           </w:p>
         </w:tc>
       </w:tr>
@@ -15133,6 +15161,9 @@
             <w:pPr>
               <w:spacing w:before="20" w:after="20" w:line="252" w:lineRule="auto"/>
             </w:pPr>
+            <w:r>
+              <w:t>25</w:t>
+            </w:r>
           </w:p>
         </w:tc>
         <w:tc>
@@ -15149,6 +15180,17 @@
             <w:pPr>
               <w:spacing w:before="20" w:after="20" w:line="252" w:lineRule="auto"/>
             </w:pPr>
+            <w:r>
+              <w:t xml:space="preserve">Baris 19-32 pada </w:t>
+            </w:r>
+            <w:proofErr w:type="spellStart"/>
+            <w:r>
+              <w:t>js</w:t>
+            </w:r>
+            <w:proofErr w:type="spellEnd"/>
+            <w:r>
+              <w:t>/app.js</w:t>
+            </w:r>
           </w:p>
         </w:tc>
       </w:tr>
@@ -15218,6 +15260,9 @@
             <w:pPr>
               <w:spacing w:before="20" w:after="20" w:line="252" w:lineRule="auto"/>
             </w:pPr>
+            <w:r>
+              <w:t>20</w:t>
+            </w:r>
           </w:p>
         </w:tc>
         <w:tc>
@@ -15234,6 +15279,43 @@
             <w:pPr>
               <w:spacing w:before="20" w:after="20" w:line="252" w:lineRule="auto"/>
             </w:pPr>
+            <w:r>
+              <w:drawing>
+                <wp:inline distT="0" distB="0" distL="0" distR="0" wp14:anchorId="4C373587" wp14:editId="7D0D59ED">
+                  <wp:extent cx="2673985" cy="2834005"/>
+                  <wp:effectExtent l="0" t="0" r="0" b="4445"/>
+                  <wp:docPr id="1286233883" name="Picture 1"/>
+                  <wp:cNvGraphicFramePr>
+                    <a:graphicFrameLocks xmlns:a="http://schemas.openxmlformats.org/drawingml/2006/main" noChangeAspect="1"/>
+                  </wp:cNvGraphicFramePr>
+                  <a:graphic xmlns:a="http://schemas.openxmlformats.org/drawingml/2006/main">
+                    <a:graphicData uri="http://schemas.openxmlformats.org/drawingml/2006/picture">
+                      <pic:pic xmlns:pic="http://schemas.openxmlformats.org/drawingml/2006/picture">
+                        <pic:nvPicPr>
+                          <pic:cNvPr id="1286233883" name=""/>
+                          <pic:cNvPicPr/>
+                        </pic:nvPicPr>
+                        <pic:blipFill>
+                          <a:blip r:embed="rId8"/>
+                          <a:stretch>
+                            <a:fillRect/>
+                          </a:stretch>
+                        </pic:blipFill>
+                        <pic:spPr>
+                          <a:xfrm>
+                            <a:off x="0" y="0"/>
+                            <a:ext cx="2673985" cy="2834005"/>
+                          </a:xfrm>
+                          <a:prstGeom prst="rect">
+                            <a:avLst/>
+                          </a:prstGeom>
+                        </pic:spPr>
+                      </pic:pic>
+                    </a:graphicData>
+                  </a:graphic>
+                </wp:inline>
+              </w:drawing>
+            </w:r>
           </w:p>
         </w:tc>
       </w:tr>
@@ -15303,6 +15385,9 @@
             <w:pPr>
               <w:spacing w:before="20" w:after="20" w:line="252" w:lineRule="auto"/>
             </w:pPr>
+            <w:r>
+              <w:t>15</w:t>
+            </w:r>
           </w:p>
         </w:tc>
         <w:tc>
@@ -15319,6 +15404,9 @@
             <w:pPr>
               <w:spacing w:before="20" w:after="20" w:line="252" w:lineRule="auto"/>
             </w:pPr>
+            <w:r>
+              <w:t>-</w:t>
+            </w:r>
           </w:p>
         </w:tc>
       </w:tr>
@@ -15388,6 +15476,9 @@
             <w:pPr>
               <w:spacing w:before="20" w:after="20" w:line="252" w:lineRule="auto"/>
             </w:pPr>
+            <w:r>
+              <w:t>100</w:t>
+            </w:r>
           </w:p>
         </w:tc>
         <w:tc>
@@ -15459,7 +15550,11 @@
               <w:right w:val="single" w:sz="4" w:space="0" w:color="B9C6E2"/>
             </w:tcBorders>
           </w:tcPr>
-          <w:p/>
+          <w:p>
+            <w:r>
+              <w:t>-</w:t>
+            </w:r>
+          </w:p>
         </w:tc>
       </w:tr>
       <w:tr>
@@ -15517,7 +15612,48 @@
               <w:right w:val="single" w:sz="4" w:space="0" w:color="B9C6E2"/>
             </w:tcBorders>
           </w:tcPr>
-          <w:p/>
+          <w:p>
+            <w:r>
+              <w:t xml:space="preserve">Cara </w:t>
+            </w:r>
+            <w:proofErr w:type="spellStart"/>
+            <w:r>
+              <w:t>menghubungkan</w:t>
+            </w:r>
+            <w:proofErr w:type="spellEnd"/>
+            <w:r>
+              <w:t xml:space="preserve"> html </w:t>
+            </w:r>
+            <w:proofErr w:type="spellStart"/>
+            <w:r>
+              <w:t>ke</w:t>
+            </w:r>
+            <w:proofErr w:type="spellEnd"/>
+            <w:r>
+              <w:t xml:space="preserve"> </w:t>
+            </w:r>
+            <w:proofErr w:type="spellStart"/>
+            <w:r>
+              <w:t>javascript</w:t>
+            </w:r>
+            <w:proofErr w:type="spellEnd"/>
+            <w:r>
+              <w:t xml:space="preserve"> </w:t>
+            </w:r>
+            <w:proofErr w:type="spellStart"/>
+            <w:r>
+              <w:t>secara</w:t>
+            </w:r>
+            <w:proofErr w:type="spellEnd"/>
+            <w:r>
+              <w:t xml:space="preserve"> </w:t>
+            </w:r>
+            <w:proofErr w:type="spellStart"/>
+            <w:r>
+              <w:t>langsung</w:t>
+            </w:r>
+            <w:proofErr w:type="spellEnd"/>
+          </w:p>
         </w:tc>
       </w:tr>
       <w:tr>
@@ -15636,7 +15772,6 @@
                 <w:color w:val="E2E8F0"/>
                 <w:sz w:val="17"/>
               </w:rPr>
-              <w:lastRenderedPageBreak/>
               <w:t>git add .</w:t>
             </w:r>
             <w:r>
@@ -19061,7 +19196,7 @@
       </w:pPr>
     </w:p>
     <w:sectPr>
-      <w:footerReference w:type="default" r:id="rId8"/>
+      <w:footerReference w:type="default" r:id="rId9"/>
       <w:pgSz w:w="11906" w:h="16838"/>
       <w:pgMar w:top="964" w:right="1077" w:bottom="907" w:left="1077" w:header="720" w:footer="720" w:gutter="0"/>
       <w:cols w:space="720"/>

</xml_diff>